<commit_message>
Fix Rol y Usuario
</commit_message>
<xml_diff>
--- a/requerimientos.docx
+++ b/requerimientos.docx
@@ -68,12 +68,14 @@
               <w:rPr>
                 <w:sz w:val="24"/>
                 <w:szCs w:val="24"/>
-              </w:rPr>
-            </w:pPr>
-            <w:r>
-              <w:rPr>
-                <w:sz w:val="24"/>
-                <w:szCs w:val="24"/>
+                <w:highlight w:val="yellow"/>
+              </w:rPr>
+            </w:pPr>
+            <w:r>
+              <w:rPr>
+                <w:sz w:val="24"/>
+                <w:szCs w:val="24"/>
+                <w:highlight w:val="yellow"/>
               </w:rPr>
               <w:t>RF1</w:t>
             </w:r>
@@ -89,12 +91,14 @@
               <w:rPr>
                 <w:sz w:val="24"/>
                 <w:szCs w:val="24"/>
-              </w:rPr>
-            </w:pPr>
-            <w:r>
-              <w:rPr>
-                <w:sz w:val="24"/>
-                <w:szCs w:val="24"/>
+                <w:highlight w:val="yellow"/>
+              </w:rPr>
+            </w:pPr>
+            <w:r>
+              <w:rPr>
+                <w:sz w:val="24"/>
+                <w:szCs w:val="24"/>
+                <w:highlight w:val="yellow"/>
               </w:rPr>
               <w:t>Gestión de usuarios</w:t>
             </w:r>
@@ -112,12 +116,14 @@
               <w:rPr>
                 <w:sz w:val="24"/>
                 <w:szCs w:val="24"/>
-              </w:rPr>
-            </w:pPr>
-            <w:r>
-              <w:rPr>
-                <w:sz w:val="24"/>
-                <w:szCs w:val="24"/>
+                <w:highlight w:val="yellow"/>
+              </w:rPr>
+            </w:pPr>
+            <w:r>
+              <w:rPr>
+                <w:sz w:val="24"/>
+                <w:szCs w:val="24"/>
+                <w:highlight w:val="yellow"/>
               </w:rPr>
               <w:t>RF2</w:t>
             </w:r>
@@ -133,12 +139,14 @@
               <w:rPr>
                 <w:sz w:val="24"/>
                 <w:szCs w:val="24"/>
-              </w:rPr>
-            </w:pPr>
-            <w:r>
-              <w:rPr>
-                <w:sz w:val="24"/>
-                <w:szCs w:val="24"/>
+                <w:highlight w:val="yellow"/>
+              </w:rPr>
+            </w:pPr>
+            <w:r>
+              <w:rPr>
+                <w:sz w:val="24"/>
+                <w:szCs w:val="24"/>
+                <w:highlight w:val="yellow"/>
               </w:rPr>
               <w:t>Mantenimiento de roles</w:t>
             </w:r>

</xml_diff>